<commit_message>
Generando 39, con gráficas .py
</commit_message>
<xml_diff>
--- a/Lab/11/salida/vaso-cilindrico_1.docx
+++ b/Lab/11/salida/vaso-cilindrico_1.docx
@@ -137,7 +137,7 @@
         <w:br/>
       </w:r>
       <w:r>
-        <w:t xml:space="preserve">Un estudiante tiene un vaso de forma cilíndrica. El vaso tiene una base circular de radio 5 cm y una altura de 9 cm, como se muestra en la figura.</w:t>
+        <w:t xml:space="preserve">Un estudiante tiene un vaso de forma cilíndrica. El vaso tiene una base circular de radio 5 cm y una altura de 8 cm, como se muestra en la figura.</w:t>
       </w:r>
     </w:p>
     <w:p>
@@ -150,7 +150,7 @@
       <w:r>
         <w:drawing>
           <wp:inline>
-            <wp:extent cx="2879999" cy="3192808"/>
+            <wp:extent cx="2879999" cy="2944719"/>
             <wp:effectExtent b="0" l="0" r="0" t="0"/>
             <wp:docPr descr="image" title="" id="21" name="Picture"/>
             <a:graphic>
@@ -180,7 +180,7 @@
                   <pic:spPr bwMode="auto">
                     <a:xfrm>
                       <a:off x="0" y="0"/>
-                      <a:ext cx="2879999" cy="3192808"/>
+                      <a:ext cx="2879999" cy="2944719"/>
                     </a:xfrm>
                     <a:prstGeom prst="rect">
                       <a:avLst/>
@@ -247,7 +247,7 @@
             <m:t>×</m:t>
           </m:r>
           <m:r>
-            <m:t>9</m:t>
+            <m:t>8</m:t>
           </m:r>
           <m:r>
             <m:rPr>
@@ -256,7 +256,7 @@
             <m:t>=</m:t>
           </m:r>
           <m:r>
-            <m:t>706.86</m:t>
+            <m:t>628.32</m:t>
           </m:r>
         </m:oMath>
       </m:oMathPara>
@@ -280,7 +280,7 @@
         </w:numPr>
       </w:pPr>
       <w:r>
-        <w:t xml:space="preserve">Al volumen del vaso: 706.86 cm³</w:t>
+        <w:t xml:space="preserve">Al volumen del vaso: 628.32 cm³</w:t>
       </w:r>
     </w:p>
     <w:p>
@@ -291,7 +291,7 @@
         </w:numPr>
       </w:pPr>
       <w:r>
-        <w:t xml:space="preserve">Al área lateral del vaso: 282.74 cm²</w:t>
+        <w:t xml:space="preserve">Al área de la tapa del vaso: 78.54 cm²</w:t>
       </w:r>
     </w:p>
     <w:p>
@@ -313,7 +313,7 @@
         </w:numPr>
       </w:pPr>
       <w:r>
-        <w:t xml:space="preserve">Al área de la tapa del vaso: 78.54 cm²</w:t>
+        <w:t xml:space="preserve">Al área lateral del vaso: 251.33 cm²</w:t>
       </w:r>
     </w:p>
     <w:p>
@@ -368,7 +368,7 @@
           <m:t>×</m:t>
         </m:r>
         <m:r>
-          <m:t>9</m:t>
+          <m:t>8</m:t>
         </m:r>
         <m:r>
           <m:rPr>
@@ -377,7 +377,7 @@
           <m:t>=</m:t>
         </m:r>
         <m:r>
-          <m:t>706.86</m:t>
+          <m:t>628.32</m:t>
         </m:r>
       </m:oMath>
       <w:r>
@@ -585,7 +585,7 @@
           <m:t>=</m:t>
         </m:r>
         <m:r>
-          <m:t>9</m:t>
+          <m:t>8</m:t>
         </m:r>
         <m:r>
           <m:rPr>
@@ -662,7 +662,7 @@
           <m:t>×</m:t>
         </m:r>
         <m:r>
-          <m:t>9</m:t>
+          <m:t>8</m:t>
         </m:r>
         <m:r>
           <m:rPr>
@@ -689,7 +689,7 @@
           <m:t>×</m:t>
         </m:r>
         <m:r>
-          <m:t>9</m:t>
+          <m:t>8</m:t>
         </m:r>
         <m:r>
           <m:rPr>
@@ -698,7 +698,7 @@
           <m:t>=</m:t>
         </m:r>
         <m:r>
-          <m:t>706.86</m:t>
+          <m:t>628.32</m:t>
         </m:r>
         <m:sSup>
           <m:e>
@@ -791,7 +791,7 @@
         <w:br/>
       </w:r>
       <w:r>
-        <w:t xml:space="preserve">Un estudiante tiene un vaso de forma cilíndrica. El vaso tiene una base circular de radio 2 cm y una altura de 7 cm, como se muestra en la figura.</w:t>
+        <w:t xml:space="preserve">Un estudiante tiene un vaso de forma cilíndrica. El vaso tiene una base circular de radio 5 cm y una altura de 7 cm, como se muestra en la figura.</w:t>
       </w:r>
     </w:p>
     <w:p>
@@ -804,7 +804,7 @@
       <w:r>
         <w:drawing>
           <wp:inline>
-            <wp:extent cx="2879999" cy="4735999"/>
+            <wp:extent cx="2879999" cy="2696629"/>
             <wp:effectExtent b="0" l="0" r="0" t="0"/>
             <wp:docPr descr="image" title="" id="25" name="Picture"/>
             <a:graphic>
@@ -834,7 +834,7 @@
                   <pic:spPr bwMode="auto">
                     <a:xfrm>
                       <a:off x="0" y="0"/>
-                      <a:ext cx="2879999" cy="4735999"/>
+                      <a:ext cx="2879999" cy="2696629"/>
                     </a:xfrm>
                     <a:prstGeom prst="rect">
                       <a:avLst/>
@@ -885,7 +885,7 @@
           <m:sSup>
             <m:e>
               <m:r>
-                <m:t>2</m:t>
+                <m:t>5</m:t>
               </m:r>
             </m:e>
             <m:sup>
@@ -910,7 +910,7 @@
             <m:t>=</m:t>
           </m:r>
           <m:r>
-            <m:t>87.96</m:t>
+            <m:t>549.78</m:t>
           </m:r>
         </m:oMath>
       </m:oMathPara>
@@ -934,7 +934,7 @@
         </w:numPr>
       </w:pPr>
       <w:r>
-        <w:t xml:space="preserve">Al volumen del vaso: 87.96 cm³</w:t>
+        <w:t xml:space="preserve">Al área de la tapa del vaso: 78.54 cm²</w:t>
       </w:r>
     </w:p>
     <w:p>
@@ -945,7 +945,7 @@
         </w:numPr>
       </w:pPr>
       <w:r>
-        <w:t xml:space="preserve">Al área de la tapa del vaso: 12.57 cm²</w:t>
+        <w:t xml:space="preserve">Al área lateral del vaso: 219.91 cm²</w:t>
       </w:r>
     </w:p>
     <w:p>
@@ -956,7 +956,7 @@
         </w:numPr>
       </w:pPr>
       <w:r>
-        <w:t xml:space="preserve">Al área lateral del vaso: 87.96 cm²</w:t>
+        <w:t xml:space="preserve">Al perímetro de la tapa del vaso: 31.42 cm</w:t>
       </w:r>
     </w:p>
     <w:p>
@@ -967,7 +967,7 @@
         </w:numPr>
       </w:pPr>
       <w:r>
-        <w:t xml:space="preserve">Al perímetro de la tapa del vaso: 12.57 cm</w:t>
+        <w:t xml:space="preserve">Al volumen del vaso: 549.78 cm³</w:t>
       </w:r>
     </w:p>
     <w:p>
@@ -1006,7 +1006,7 @@
         <m:sSup>
           <m:e>
             <m:r>
-              <m:t>2</m:t>
+              <m:t>5</m:t>
             </m:r>
           </m:e>
           <m:sup>
@@ -1031,7 +1031,7 @@
           <m:t>=</m:t>
         </m:r>
         <m:r>
-          <m:t>87.96</m:t>
+          <m:t>549.78</m:t>
         </m:r>
       </m:oMath>
       <w:r>
@@ -1204,7 +1204,7 @@
           <m:t>=</m:t>
         </m:r>
         <m:r>
-          <m:t>2</m:t>
+          <m:t>5</m:t>
         </m:r>
         <m:r>
           <m:rPr>
@@ -1298,7 +1298,7 @@
               </m:dPr>
               <m:e>
                 <m:r>
-                  <m:t>2</m:t>
+                  <m:t>5</m:t>
                 </m:r>
               </m:e>
             </m:d>
@@ -1334,7 +1334,7 @@
           <m:t>×</m:t>
         </m:r>
         <m:r>
-          <m:t>4</m:t>
+          <m:t>25</m:t>
         </m:r>
         <m:r>
           <m:rPr>
@@ -1352,7 +1352,7 @@
           <m:t>=</m:t>
         </m:r>
         <m:r>
-          <m:t>87.96</m:t>
+          <m:t>549.78</m:t>
         </m:r>
         <m:sSup>
           <m:e>
@@ -1391,40 +1391,40 @@
         </w:numPr>
       </w:pPr>
       <w:r>
+        <w:t xml:space="preserve">Falso</w:t>
+      </w:r>
+    </w:p>
+    <w:p>
+      <w:pPr>
+        <w:numPr>
+          <w:ilvl w:val="1"/>
+          <w:numId w:val="1009"/>
+        </w:numPr>
+      </w:pPr>
+      <w:r>
+        <w:t xml:space="preserve">Falso</w:t>
+      </w:r>
+    </w:p>
+    <w:p>
+      <w:pPr>
+        <w:numPr>
+          <w:ilvl w:val="1"/>
+          <w:numId w:val="1009"/>
+        </w:numPr>
+      </w:pPr>
+      <w:r>
+        <w:t xml:space="preserve">Falso</w:t>
+      </w:r>
+    </w:p>
+    <w:p>
+      <w:pPr>
+        <w:numPr>
+          <w:ilvl w:val="1"/>
+          <w:numId w:val="1009"/>
+        </w:numPr>
+      </w:pPr>
+      <w:r>
         <w:t xml:space="preserve">Verdadero</w:t>
-      </w:r>
-    </w:p>
-    <w:p>
-      <w:pPr>
-        <w:numPr>
-          <w:ilvl w:val="1"/>
-          <w:numId w:val="1009"/>
-        </w:numPr>
-      </w:pPr>
-      <w:r>
-        <w:t xml:space="preserve">Falso</w:t>
-      </w:r>
-    </w:p>
-    <w:p>
-      <w:pPr>
-        <w:numPr>
-          <w:ilvl w:val="1"/>
-          <w:numId w:val="1009"/>
-        </w:numPr>
-      </w:pPr>
-      <w:r>
-        <w:t xml:space="preserve">Falso</w:t>
-      </w:r>
-    </w:p>
-    <w:p>
-      <w:pPr>
-        <w:numPr>
-          <w:ilvl w:val="1"/>
-          <w:numId w:val="1009"/>
-        </w:numPr>
-      </w:pPr>
-      <w:r>
-        <w:t xml:space="preserve">Falso</w:t>
       </w:r>
     </w:p>
     <w:p>
@@ -1445,7 +1445,7 @@
         <w:br/>
       </w:r>
       <w:r>
-        <w:t xml:space="preserve">Un estudiante tiene un vaso de forma cilíndrica. El vaso tiene una base circular de radio 4 cm y una altura de 7 cm, como se muestra en la figura.</w:t>
+        <w:t xml:space="preserve">Un estudiante tiene un vaso de forma cilíndrica. El vaso tiene una base circular de radio 5 cm y una altura de 6 cm, como se muestra en la figura.</w:t>
       </w:r>
     </w:p>
     <w:p>
@@ -1458,7 +1458,7 @@
       <w:r>
         <w:drawing>
           <wp:inline>
-            <wp:extent cx="2879999" cy="3034977"/>
+            <wp:extent cx="2879999" cy="2459325"/>
             <wp:effectExtent b="0" l="0" r="0" t="0"/>
             <wp:docPr descr="image" title="" id="29" name="Picture"/>
             <a:graphic>
@@ -1488,7 +1488,7 @@
                   <pic:spPr bwMode="auto">
                     <a:xfrm>
                       <a:off x="0" y="0"/>
-                      <a:ext cx="2879999" cy="3034977"/>
+                      <a:ext cx="2879999" cy="2459325"/>
                     </a:xfrm>
                     <a:prstGeom prst="rect">
                       <a:avLst/>
@@ -1539,7 +1539,7 @@
           <m:sSup>
             <m:e>
               <m:r>
-                <m:t>4</m:t>
+                <m:t>5</m:t>
               </m:r>
             </m:e>
             <m:sup>
@@ -1555,7 +1555,7 @@
             <m:t>×</m:t>
           </m:r>
           <m:r>
-            <m:t>7</m:t>
+            <m:t>6</m:t>
           </m:r>
           <m:r>
             <m:rPr>
@@ -1564,7 +1564,7 @@
             <m:t>=</m:t>
           </m:r>
           <m:r>
-            <m:t>351.86</m:t>
+            <m:t>471.24</m:t>
           </m:r>
         </m:oMath>
       </m:oMathPara>
@@ -1588,7 +1588,7 @@
         </w:numPr>
       </w:pPr>
       <w:r>
-        <w:t xml:space="preserve">Al volumen del vaso: 351.86 cm³</w:t>
+        <w:t xml:space="preserve">Al perímetro de la tapa del vaso: 31.42 cm</w:t>
       </w:r>
     </w:p>
     <w:p>
@@ -1599,7 +1599,7 @@
         </w:numPr>
       </w:pPr>
       <w:r>
-        <w:t xml:space="preserve">Al área de la tapa del vaso: 50.27 cm²</w:t>
+        <w:t xml:space="preserve">Al área lateral del vaso: 188.5 cm²</w:t>
       </w:r>
     </w:p>
     <w:p>
@@ -1610,7 +1610,7 @@
         </w:numPr>
       </w:pPr>
       <w:r>
-        <w:t xml:space="preserve">Al área lateral del vaso: 175.93 cm²</w:t>
+        <w:t xml:space="preserve">Al área de la tapa del vaso: 78.54 cm²</w:t>
       </w:r>
     </w:p>
     <w:p>
@@ -1621,7 +1621,7 @@
         </w:numPr>
       </w:pPr>
       <w:r>
-        <w:t xml:space="preserve">Al perímetro de la tapa del vaso: 25.13 cm</w:t>
+        <w:t xml:space="preserve">Al volumen del vaso: 471.24 cm³</w:t>
       </w:r>
     </w:p>
     <w:p>
@@ -1660,7 +1660,7 @@
         <m:sSup>
           <m:e>
             <m:r>
-              <m:t>4</m:t>
+              <m:t>5</m:t>
             </m:r>
           </m:e>
           <m:sup>
@@ -1676,7 +1676,7 @@
           <m:t>×</m:t>
         </m:r>
         <m:r>
-          <m:t>7</m:t>
+          <m:t>6</m:t>
         </m:r>
         <m:r>
           <m:rPr>
@@ -1685,7 +1685,7 @@
           <m:t>=</m:t>
         </m:r>
         <m:r>
-          <m:t>351.86</m:t>
+          <m:t>471.24</m:t>
         </m:r>
       </m:oMath>
       <w:r>
@@ -1858,7 +1858,7 @@
           <m:t>=</m:t>
         </m:r>
         <m:r>
-          <m:t>4</m:t>
+          <m:t>5</m:t>
         </m:r>
         <m:r>
           <m:rPr>
@@ -1893,7 +1893,7 @@
           <m:t>=</m:t>
         </m:r>
         <m:r>
-          <m:t>7</m:t>
+          <m:t>6</m:t>
         </m:r>
         <m:r>
           <m:rPr>
@@ -1952,7 +1952,7 @@
               </m:dPr>
               <m:e>
                 <m:r>
-                  <m:t>4</m:t>
+                  <m:t>5</m:t>
                 </m:r>
               </m:e>
             </m:d>
@@ -1970,7 +1970,7 @@
           <m:t>×</m:t>
         </m:r>
         <m:r>
-          <m:t>7</m:t>
+          <m:t>6</m:t>
         </m:r>
         <m:r>
           <m:rPr>
@@ -1988,7 +1988,7 @@
           <m:t>×</m:t>
         </m:r>
         <m:r>
-          <m:t>16</m:t>
+          <m:t>25</m:t>
         </m:r>
         <m:r>
           <m:rPr>
@@ -1997,7 +1997,7 @@
           <m:t>×</m:t>
         </m:r>
         <m:r>
-          <m:t>7</m:t>
+          <m:t>6</m:t>
         </m:r>
         <m:r>
           <m:rPr>
@@ -2006,7 +2006,7 @@
           <m:t>=</m:t>
         </m:r>
         <m:r>
-          <m:t>351.86</m:t>
+          <m:t>471.24</m:t>
         </m:r>
         <m:sSup>
           <m:e>
@@ -2045,40 +2045,40 @@
         </w:numPr>
       </w:pPr>
       <w:r>
+        <w:t xml:space="preserve">Falso</w:t>
+      </w:r>
+    </w:p>
+    <w:p>
+      <w:pPr>
+        <w:numPr>
+          <w:ilvl w:val="1"/>
+          <w:numId w:val="1013"/>
+        </w:numPr>
+      </w:pPr>
+      <w:r>
+        <w:t xml:space="preserve">Falso</w:t>
+      </w:r>
+    </w:p>
+    <w:p>
+      <w:pPr>
+        <w:numPr>
+          <w:ilvl w:val="1"/>
+          <w:numId w:val="1013"/>
+        </w:numPr>
+      </w:pPr>
+      <w:r>
+        <w:t xml:space="preserve">Falso</w:t>
+      </w:r>
+    </w:p>
+    <w:p>
+      <w:pPr>
+        <w:numPr>
+          <w:ilvl w:val="1"/>
+          <w:numId w:val="1013"/>
+        </w:numPr>
+      </w:pPr>
+      <w:r>
         <w:t xml:space="preserve">Verdadero</w:t>
-      </w:r>
-    </w:p>
-    <w:p>
-      <w:pPr>
-        <w:numPr>
-          <w:ilvl w:val="1"/>
-          <w:numId w:val="1013"/>
-        </w:numPr>
-      </w:pPr>
-      <w:r>
-        <w:t xml:space="preserve">Falso</w:t>
-      </w:r>
-    </w:p>
-    <w:p>
-      <w:pPr>
-        <w:numPr>
-          <w:ilvl w:val="1"/>
-          <w:numId w:val="1013"/>
-        </w:numPr>
-      </w:pPr>
-      <w:r>
-        <w:t xml:space="preserve">Falso</w:t>
-      </w:r>
-    </w:p>
-    <w:p>
-      <w:pPr>
-        <w:numPr>
-          <w:ilvl w:val="1"/>
-          <w:numId w:val="1013"/>
-        </w:numPr>
-      </w:pPr>
-      <w:r>
-        <w:t xml:space="preserve">Falso</w:t>
       </w:r>
     </w:p>
     <w:p>
@@ -2099,7 +2099,7 @@
         <w:br/>
       </w:r>
       <w:r>
-        <w:t xml:space="preserve">Un estudiante tiene un vaso de forma cilíndrica. El vaso tiene una base circular de radio 3 cm y una altura de 9 cm, como se muestra en la figura.</w:t>
+        <w:t xml:space="preserve">Un estudiante tiene un vaso de forma cilíndrica. El vaso tiene una base circular de radio 5 cm y una altura de 7 cm, como se muestra en la figura.</w:t>
       </w:r>
     </w:p>
     <w:p>
@@ -2112,7 +2112,7 @@
       <w:r>
         <w:drawing>
           <wp:inline>
-            <wp:extent cx="2879999" cy="4409491"/>
+            <wp:extent cx="2879999" cy="2696629"/>
             <wp:effectExtent b="0" l="0" r="0" t="0"/>
             <wp:docPr descr="image" title="" id="33" name="Picture"/>
             <a:graphic>
@@ -2142,7 +2142,7 @@
                   <pic:spPr bwMode="auto">
                     <a:xfrm>
                       <a:off x="0" y="0"/>
-                      <a:ext cx="2879999" cy="4409491"/>
+                      <a:ext cx="2879999" cy="2696629"/>
                     </a:xfrm>
                     <a:prstGeom prst="rect">
                       <a:avLst/>
@@ -2193,7 +2193,7 @@
           <m:sSup>
             <m:e>
               <m:r>
-                <m:t>3</m:t>
+                <m:t>5</m:t>
               </m:r>
             </m:e>
             <m:sup>
@@ -2209,7 +2209,7 @@
             <m:t>×</m:t>
           </m:r>
           <m:r>
-            <m:t>9</m:t>
+            <m:t>7</m:t>
           </m:r>
           <m:r>
             <m:rPr>
@@ -2218,7 +2218,7 @@
             <m:t>=</m:t>
           </m:r>
           <m:r>
-            <m:t>254.47</m:t>
+            <m:t>549.78</m:t>
           </m:r>
         </m:oMath>
       </m:oMathPara>
@@ -2242,7 +2242,7 @@
         </w:numPr>
       </w:pPr>
       <w:r>
-        <w:t xml:space="preserve">Al área de la tapa del vaso: 28.27 cm²</w:t>
+        <w:t xml:space="preserve">Al área de la tapa del vaso: 78.54 cm²</w:t>
       </w:r>
     </w:p>
     <w:p>
@@ -2253,7 +2253,7 @@
         </w:numPr>
       </w:pPr>
       <w:r>
-        <w:t xml:space="preserve">Al volumen del vaso: 254.47 cm³</w:t>
+        <w:t xml:space="preserve">Al volumen del vaso: 549.78 cm³</w:t>
       </w:r>
     </w:p>
     <w:p>
@@ -2264,7 +2264,7 @@
         </w:numPr>
       </w:pPr>
       <w:r>
-        <w:t xml:space="preserve">Al perímetro de la tapa del vaso: 18.85 cm</w:t>
+        <w:t xml:space="preserve">Al perímetro de la tapa del vaso: 31.42 cm</w:t>
       </w:r>
     </w:p>
     <w:p>
@@ -2275,7 +2275,7 @@
         </w:numPr>
       </w:pPr>
       <w:r>
-        <w:t xml:space="preserve">Al área lateral del vaso: 169.65 cm²</w:t>
+        <w:t xml:space="preserve">Al área lateral del vaso: 219.91 cm²</w:t>
       </w:r>
     </w:p>
     <w:p>
@@ -2314,7 +2314,7 @@
         <m:sSup>
           <m:e>
             <m:r>
-              <m:t>3</m:t>
+              <m:t>5</m:t>
             </m:r>
           </m:e>
           <m:sup>
@@ -2330,7 +2330,7 @@
           <m:t>×</m:t>
         </m:r>
         <m:r>
-          <m:t>9</m:t>
+          <m:t>7</m:t>
         </m:r>
         <m:r>
           <m:rPr>
@@ -2339,7 +2339,7 @@
           <m:t>=</m:t>
         </m:r>
         <m:r>
-          <m:t>254.47</m:t>
+          <m:t>549.78</m:t>
         </m:r>
       </m:oMath>
       <w:r>
@@ -2512,7 +2512,7 @@
           <m:t>=</m:t>
         </m:r>
         <m:r>
-          <m:t>3</m:t>
+          <m:t>5</m:t>
         </m:r>
         <m:r>
           <m:rPr>
@@ -2547,7 +2547,7 @@
           <m:t>=</m:t>
         </m:r>
         <m:r>
-          <m:t>9</m:t>
+          <m:t>7</m:t>
         </m:r>
         <m:r>
           <m:rPr>
@@ -2606,7 +2606,7 @@
               </m:dPr>
               <m:e>
                 <m:r>
-                  <m:t>3</m:t>
+                  <m:t>5</m:t>
                 </m:r>
               </m:e>
             </m:d>
@@ -2624,7 +2624,7 @@
           <m:t>×</m:t>
         </m:r>
         <m:r>
-          <m:t>9</m:t>
+          <m:t>7</m:t>
         </m:r>
         <m:r>
           <m:rPr>
@@ -2642,7 +2642,7 @@
           <m:t>×</m:t>
         </m:r>
         <m:r>
-          <m:t>9</m:t>
+          <m:t>25</m:t>
         </m:r>
         <m:r>
           <m:rPr>
@@ -2651,7 +2651,7 @@
           <m:t>×</m:t>
         </m:r>
         <m:r>
-          <m:t>9</m:t>
+          <m:t>7</m:t>
         </m:r>
         <m:r>
           <m:rPr>
@@ -2660,7 +2660,7 @@
           <m:t>=</m:t>
         </m:r>
         <m:r>
-          <m:t>254.47</m:t>
+          <m:t>549.78</m:t>
         </m:r>
         <m:sSup>
           <m:e>
@@ -2896,40 +2896,40 @@
         </w:numPr>
       </w:pPr>
       <w:r>
+        <w:t xml:space="preserve">Al perímetro de la tapa del vaso: 12.57 cm</w:t>
+      </w:r>
+    </w:p>
+    <w:p>
+      <w:pPr>
+        <w:numPr>
+          <w:ilvl w:val="1"/>
+          <w:numId w:val="1018"/>
+        </w:numPr>
+      </w:pPr>
+      <w:r>
+        <w:t xml:space="preserve">Al área lateral del vaso: 87.96 cm²</w:t>
+      </w:r>
+    </w:p>
+    <w:p>
+      <w:pPr>
+        <w:numPr>
+          <w:ilvl w:val="1"/>
+          <w:numId w:val="1018"/>
+        </w:numPr>
+      </w:pPr>
+      <w:r>
+        <w:t xml:space="preserve">Al volumen del vaso: 87.96 cm³</w:t>
+      </w:r>
+    </w:p>
+    <w:p>
+      <w:pPr>
+        <w:numPr>
+          <w:ilvl w:val="1"/>
+          <w:numId w:val="1018"/>
+        </w:numPr>
+      </w:pPr>
+      <w:r>
         <w:t xml:space="preserve">Al área de la tapa del vaso: 12.57 cm²</w:t>
-      </w:r>
-    </w:p>
-    <w:p>
-      <w:pPr>
-        <w:numPr>
-          <w:ilvl w:val="1"/>
-          <w:numId w:val="1018"/>
-        </w:numPr>
-      </w:pPr>
-      <w:r>
-        <w:t xml:space="preserve">Al perímetro de la tapa del vaso: 12.57 cm</w:t>
-      </w:r>
-    </w:p>
-    <w:p>
-      <w:pPr>
-        <w:numPr>
-          <w:ilvl w:val="1"/>
-          <w:numId w:val="1018"/>
-        </w:numPr>
-      </w:pPr>
-      <w:r>
-        <w:t xml:space="preserve">Al área lateral del vaso: 87.96 cm²</w:t>
-      </w:r>
-    </w:p>
-    <w:p>
-      <w:pPr>
-        <w:numPr>
-          <w:ilvl w:val="1"/>
-          <w:numId w:val="1018"/>
-        </w:numPr>
-      </w:pPr>
-      <w:r>
-        <w:t xml:space="preserve">Al volumen del vaso: 87.96 cm³</w:t>
       </w:r>
     </w:p>
     <w:p>
@@ -3375,18 +3375,18 @@
         </w:numPr>
       </w:pPr>
       <w:r>
+        <w:t xml:space="preserve">Verdadero</w:t>
+      </w:r>
+    </w:p>
+    <w:p>
+      <w:pPr>
+        <w:numPr>
+          <w:ilvl w:val="1"/>
+          <w:numId w:val="1021"/>
+        </w:numPr>
+      </w:pPr>
+      <w:r>
         <w:t xml:space="preserve">Falso</w:t>
-      </w:r>
-    </w:p>
-    <w:p>
-      <w:pPr>
-        <w:numPr>
-          <w:ilvl w:val="1"/>
-          <w:numId w:val="1021"/>
-        </w:numPr>
-      </w:pPr>
-      <w:r>
-        <w:t xml:space="preserve">Verdadero</w:t>
       </w:r>
     </w:p>
     <w:bookmarkEnd w:id="40"/>

</xml_diff>